<commit_message>
Adición de imagenes faltantes
</commit_message>
<xml_diff>
--- a/Manual de Usuario THE DOPO HARDEST GAME.docx
+++ b/Manual de Usuario THE DOPO HARDEST GAME.docx
@@ -98,24 +98,18 @@
     </w:p>
     <w:p>
       <w:r>
-        <w:t>Eres un cuadrado de colores atrapado en un laberinto lleno de</w:t>
+        <w:t>Eres un cuadrado de colores atrapado en un laberinto lleno de enemigos. Tu misión es recoger todas las monedas del nivel y</w:t>
       </w:r>
       <w:r>
         <w:t xml:space="preserve"> </w:t>
       </w:r>
       <w:r>
-        <w:t>enemigos. Tu misión es recoger todas las monedas del nivel y</w:t>
+        <w:t>llegar a la meta sin que te atrapen. Simple de entender,</w:t>
       </w:r>
       <w:r>
         <w:t xml:space="preserve"> </w:t>
       </w:r>
       <w:r>
-        <w:t>llegar a la meta sin que te atrapen. Simple de entender,</w:t>
-      </w:r>
-      <w:r>
-        <w:t xml:space="preserve"> </w:t>
-      </w:r>
-      <w:r>
         <w:t>difícil de dominar.</w:t>
       </w:r>
     </w:p>
@@ -137,6 +131,9 @@
     </w:p>
     <w:p>
       <w:r>
+        <w:rPr>
+          <w:noProof/>
+        </w:rPr>
         <w:drawing>
           <wp:inline distT="0" distB="0" distL="0" distR="0" wp14:anchorId="0A3C4B7D" wp14:editId="71B1E46E">
             <wp:extent cx="2452071" cy="1777042"/>
@@ -187,6 +184,9 @@
     </w:p>
     <w:p>
       <w:r>
+        <w:rPr>
+          <w:noProof/>
+        </w:rPr>
         <w:drawing>
           <wp:inline distT="0" distB="0" distL="0" distR="0" wp14:anchorId="1963A2D7" wp14:editId="06BDF9C9">
             <wp:extent cx="3695623" cy="2656935"/>
@@ -298,6 +298,9 @@
     </w:p>
     <w:p>
       <w:r>
+        <w:rPr>
+          <w:noProof/>
+        </w:rPr>
         <w:drawing>
           <wp:inline distT="0" distB="0" distL="0" distR="0" wp14:anchorId="4CC1C6C1" wp14:editId="6A30DC69">
             <wp:extent cx="3321170" cy="2305429"/>
@@ -410,6 +413,9 @@
     </w:p>
     <w:p>
       <w:r>
+        <w:rPr>
+          <w:noProof/>
+        </w:rPr>
         <w:drawing>
           <wp:inline distT="0" distB="0" distL="0" distR="0" wp14:anchorId="09CECEAE" wp14:editId="4E936920">
             <wp:extent cx="4354729" cy="2311879"/>
@@ -449,13 +455,8 @@
     </w:p>
     <w:p>
       <w:r>
-        <w:t xml:space="preserve">  2 </w:t>
-      </w:r>
-      <w:proofErr w:type="gramStart"/>
-      <w:r>
-        <w:t>Jugadores</w:t>
-      </w:r>
-      <w:proofErr w:type="gramEnd"/>
+        <w:t xml:space="preserve">  2 Jugadores</w:t>
+      </w:r>
     </w:p>
     <w:p>
       <w:r>
@@ -470,6 +471,9 @@
     </w:p>
     <w:p>
       <w:r>
+        <w:rPr>
+          <w:noProof/>
+        </w:rPr>
         <w:drawing>
           <wp:inline distT="0" distB="0" distL="0" distR="0" wp14:anchorId="0AA6B06F" wp14:editId="4DDEEDEF">
             <wp:extent cx="2794958" cy="2172906"/>
@@ -516,6 +520,9 @@
     </w:p>
     <w:p>
       <w:r>
+        <w:rPr>
+          <w:noProof/>
+        </w:rPr>
         <w:drawing>
           <wp:inline distT="0" distB="0" distL="0" distR="0" wp14:anchorId="70A3DF63" wp14:editId="48F1F13F">
             <wp:extent cx="3571336" cy="2570408"/>
@@ -578,6 +585,9 @@
     </w:p>
     <w:p>
       <w:r>
+        <w:rPr>
+          <w:noProof/>
+        </w:rPr>
         <w:drawing>
           <wp:inline distT="0" distB="0" distL="0" distR="0" wp14:anchorId="5CF889DE" wp14:editId="7197AB5B">
             <wp:extent cx="3830128" cy="3040960"/>
@@ -668,43 +678,23 @@
     </w:p>
     <w:p>
       <w:r>
-        <w:t xml:space="preserve">  ↑ Arriba            </w:t>
-      </w:r>
-      <w:proofErr w:type="gramStart"/>
-      <w:r>
-        <w:t>W  Arriba</w:t>
-      </w:r>
-      <w:proofErr w:type="gramEnd"/>
-    </w:p>
-    <w:p>
-      <w:r>
-        <w:t xml:space="preserve">  ↓ Abajo             </w:t>
-      </w:r>
-      <w:proofErr w:type="gramStart"/>
-      <w:r>
-        <w:t>S  Abajo</w:t>
-      </w:r>
-      <w:proofErr w:type="gramEnd"/>
-    </w:p>
-    <w:p>
-      <w:r>
-        <w:t xml:space="preserve">  ← Izquierda         </w:t>
-      </w:r>
-      <w:proofErr w:type="gramStart"/>
-      <w:r>
-        <w:t>A  Izquierda</w:t>
-      </w:r>
-      <w:proofErr w:type="gramEnd"/>
-    </w:p>
-    <w:p>
-      <w:r>
-        <w:t xml:space="preserve">  → Derecha           </w:t>
-      </w:r>
-      <w:proofErr w:type="gramStart"/>
-      <w:r>
-        <w:t>D  Derecha</w:t>
-      </w:r>
-      <w:proofErr w:type="gramEnd"/>
+        <w:t xml:space="preserve">  ↑ Arriba            W  Arriba</w:t>
+      </w:r>
+    </w:p>
+    <w:p>
+      <w:r>
+        <w:t xml:space="preserve">  ↓ Abajo             S  Abajo</w:t>
+      </w:r>
+    </w:p>
+    <w:p>
+      <w:r>
+        <w:t xml:space="preserve">  ← Izquierda         A  Izquierda</w:t>
+      </w:r>
+    </w:p>
+    <w:p>
+      <w:r>
+        <w:t xml:space="preserve">  → Derecha           D  Derecha</w:t>
+      </w:r>
     </w:p>
     <w:p/>
     <w:p>
@@ -714,15 +704,7 @@
     </w:p>
     <w:p>
       <w:r>
-        <w:t xml:space="preserve">  M  </w:t>
-      </w:r>
-      <w:proofErr w:type="gramStart"/>
-      <w:r>
-        <w:t xml:space="preserve">   (</w:t>
-      </w:r>
-      <w:proofErr w:type="gramEnd"/>
-      <w:r>
-        <w:t>mientras pausado) Volver al menú principal</w:t>
+        <w:t xml:space="preserve">  M     (mientras pausado) Volver al menú principal</w:t>
       </w:r>
     </w:p>
     <w:p/>
@@ -738,6 +720,9 @@
     </w:p>
     <w:p>
       <w:r>
+        <w:rPr>
+          <w:noProof/>
+        </w:rPr>
         <w:drawing>
           <wp:inline distT="0" distB="0" distL="0" distR="0" wp14:anchorId="2B19A5DF" wp14:editId="6EF7DAAA">
             <wp:extent cx="2760453" cy="2232592"/>
@@ -1041,7 +1026,253 @@
         <w:t>del inicio del nivel.</w:t>
       </w:r>
     </w:p>
-    <w:p/>
+    <w:p>
+      <w:r>
+        <w:t>Camino A</w:t>
+      </w:r>
+    </w:p>
+    <w:p>
+      <w:r>
+        <w:drawing>
+          <wp:inline distT="0" distB="0" distL="0" distR="0" wp14:anchorId="4BBEDB87" wp14:editId="6F0CE76F">
+            <wp:extent cx="257175" cy="251584"/>
+            <wp:effectExtent l="0" t="0" r="0" b="0"/>
+            <wp:docPr id="732194370" name="Imagen 1"/>
+            <wp:cNvGraphicFramePr>
+              <a:graphicFrameLocks xmlns:a="http://schemas.openxmlformats.org/drawingml/2006/main" noChangeAspect="1"/>
+            </wp:cNvGraphicFramePr>
+            <a:graphic xmlns:a="http://schemas.openxmlformats.org/drawingml/2006/main">
+              <a:graphicData uri="http://schemas.openxmlformats.org/drawingml/2006/picture">
+                <pic:pic xmlns:pic="http://schemas.openxmlformats.org/drawingml/2006/picture">
+                  <pic:nvPicPr>
+                    <pic:cNvPr id="732194370" name=""/>
+                    <pic:cNvPicPr/>
+                  </pic:nvPicPr>
+                  <pic:blipFill rotWithShape="1">
+                    <a:blip r:embed="rId18"/>
+                    <a:srcRect l="11886" t="5555" r="76221" b="77768"/>
+                    <a:stretch>
+                      <a:fillRect/>
+                    </a:stretch>
+                  </pic:blipFill>
+                  <pic:spPr bwMode="auto">
+                    <a:xfrm>
+                      <a:off x="0" y="0"/>
+                      <a:ext cx="258950" cy="253321"/>
+                    </a:xfrm>
+                    <a:prstGeom prst="rect">
+                      <a:avLst/>
+                    </a:prstGeom>
+                    <a:ln>
+                      <a:noFill/>
+                    </a:ln>
+                    <a:extLst>
+                      <a:ext uri="{53640926-AAD7-44D8-BBD7-CCE9431645EC}">
+                        <a14:shadowObscured xmlns:a14="http://schemas.microsoft.com/office/drawing/2010/main"/>
+                      </a:ext>
+                    </a:extLst>
+                  </pic:spPr>
+                </pic:pic>
+              </a:graphicData>
+            </a:graphic>
+          </wp:inline>
+        </w:drawing>
+      </w:r>
+    </w:p>
+    <w:p>
+      <w:r>
+        <w:t>Fondo del juego</w:t>
+      </w:r>
+    </w:p>
+    <w:p>
+      <w:r>
+        <w:t xml:space="preserve">Camino B </w:t>
+      </w:r>
+    </w:p>
+    <w:p>
+      <w:r>
+        <w:drawing>
+          <wp:inline distT="0" distB="0" distL="0" distR="0" wp14:anchorId="4D099429" wp14:editId="6A18FB17">
+            <wp:extent cx="172720" cy="171450"/>
+            <wp:effectExtent l="0" t="0" r="0" b="0"/>
+            <wp:docPr id="254083675" name="Imagen 1"/>
+            <wp:cNvGraphicFramePr>
+              <a:graphicFrameLocks xmlns:a="http://schemas.openxmlformats.org/drawingml/2006/main" noChangeAspect="1"/>
+            </wp:cNvGraphicFramePr>
+            <a:graphic xmlns:a="http://schemas.openxmlformats.org/drawingml/2006/main">
+              <a:graphicData uri="http://schemas.openxmlformats.org/drawingml/2006/picture">
+                <pic:pic xmlns:pic="http://schemas.openxmlformats.org/drawingml/2006/picture">
+                  <pic:nvPicPr>
+                    <pic:cNvPr id="254083675" name=""/>
+                    <pic:cNvPicPr/>
+                  </pic:nvPicPr>
+                  <pic:blipFill rotWithShape="1">
+                    <a:blip r:embed="rId18"/>
+                    <a:srcRect l="10077" t="41111" r="75858" b="38877"/>
+                    <a:stretch>
+                      <a:fillRect/>
+                    </a:stretch>
+                  </pic:blipFill>
+                  <pic:spPr bwMode="auto">
+                    <a:xfrm>
+                      <a:off x="0" y="0"/>
+                      <a:ext cx="172843" cy="171573"/>
+                    </a:xfrm>
+                    <a:prstGeom prst="rect">
+                      <a:avLst/>
+                    </a:prstGeom>
+                    <a:ln>
+                      <a:noFill/>
+                    </a:ln>
+                    <a:extLst>
+                      <a:ext uri="{53640926-AAD7-44D8-BBD7-CCE9431645EC}">
+                        <a14:shadowObscured xmlns:a14="http://schemas.microsoft.com/office/drawing/2010/main"/>
+                      </a:ext>
+                    </a:extLst>
+                  </pic:spPr>
+                </pic:pic>
+              </a:graphicData>
+            </a:graphic>
+          </wp:inline>
+        </w:drawing>
+      </w:r>
+    </w:p>
+    <w:p>
+      <w:r>
+        <w:t>Fondo del juego</w:t>
+      </w:r>
+    </w:p>
+    <w:p/>
+    <w:p>
+      <w:r>
+        <w:t xml:space="preserve">Pared </w:t>
+      </w:r>
+    </w:p>
+    <w:p>
+      <w:r>
+        <w:drawing>
+          <wp:inline distT="0" distB="0" distL="0" distR="0" wp14:anchorId="5824A0ED" wp14:editId="6C431B03">
+            <wp:extent cx="161925" cy="142875"/>
+            <wp:effectExtent l="0" t="0" r="9525" b="9525"/>
+            <wp:docPr id="1340833864" name="Imagen 1"/>
+            <wp:cNvGraphicFramePr>
+              <a:graphicFrameLocks xmlns:a="http://schemas.openxmlformats.org/drawingml/2006/main" noChangeAspect="1"/>
+            </wp:cNvGraphicFramePr>
+            <a:graphic xmlns:a="http://schemas.openxmlformats.org/drawingml/2006/main">
+              <a:graphicData uri="http://schemas.openxmlformats.org/drawingml/2006/picture">
+                <pic:pic xmlns:pic="http://schemas.openxmlformats.org/drawingml/2006/picture">
+                  <pic:nvPicPr>
+                    <pic:cNvPr id="1340833864" name=""/>
+                    <pic:cNvPicPr/>
+                  </pic:nvPicPr>
+                  <pic:blipFill rotWithShape="1">
+                    <a:blip r:embed="rId18"/>
+                    <a:srcRect l="13178" t="78889" r="73636" b="4434"/>
+                    <a:stretch>
+                      <a:fillRect/>
+                    </a:stretch>
+                  </pic:blipFill>
+                  <pic:spPr bwMode="auto">
+                    <a:xfrm>
+                      <a:off x="0" y="0"/>
+                      <a:ext cx="162044" cy="142980"/>
+                    </a:xfrm>
+                    <a:prstGeom prst="rect">
+                      <a:avLst/>
+                    </a:prstGeom>
+                    <a:ln>
+                      <a:noFill/>
+                    </a:ln>
+                    <a:extLst>
+                      <a:ext uri="{53640926-AAD7-44D8-BBD7-CCE9431645EC}">
+                        <a14:shadowObscured xmlns:a14="http://schemas.microsoft.com/office/drawing/2010/main"/>
+                      </a:ext>
+                    </a:extLst>
+                  </pic:spPr>
+                </pic:pic>
+              </a:graphicData>
+            </a:graphic>
+          </wp:inline>
+        </w:drawing>
+      </w:r>
+    </w:p>
+    <w:p>
+      <w:r>
+        <w:t>Fondo del juego</w:t>
+      </w:r>
+      <w:r>
+        <w:t>, no permite el paso de enemigo o jugador</w:t>
+      </w:r>
+    </w:p>
+    <w:p/>
+    <w:p/>
+    <w:p/>
+    <w:p>
+      <w:r>
+        <w:lastRenderedPageBreak/>
+        <w:t>Spawn J1,J2</w:t>
+      </w:r>
+    </w:p>
+    <w:p>
+      <w:r>
+        <w:rPr>
+          <w:noProof/>
+        </w:rPr>
+        <w:drawing>
+          <wp:inline distT="0" distB="0" distL="0" distR="0" wp14:anchorId="49501FF4" wp14:editId="21E6B2F4">
+            <wp:extent cx="172720" cy="172720"/>
+            <wp:effectExtent l="0" t="0" r="0" b="0"/>
+            <wp:docPr id="924262574" name="Imagen 5"/>
+            <wp:cNvGraphicFramePr>
+              <a:graphicFrameLocks xmlns:a="http://schemas.openxmlformats.org/drawingml/2006/main" noChangeAspect="1"/>
+            </wp:cNvGraphicFramePr>
+            <a:graphic xmlns:a="http://schemas.openxmlformats.org/drawingml/2006/main">
+              <a:graphicData uri="http://schemas.openxmlformats.org/drawingml/2006/picture">
+                <pic:pic xmlns:pic="http://schemas.openxmlformats.org/drawingml/2006/picture">
+                  <pic:nvPicPr>
+                    <pic:cNvPr id="0" name="Picture 9"/>
+                    <pic:cNvPicPr>
+                      <a:picLocks noChangeAspect="1" noChangeArrowheads="1"/>
+                    </pic:cNvPicPr>
+                  </pic:nvPicPr>
+                  <pic:blipFill>
+                    <a:blip r:embed="rId17">
+                      <a:extLst>
+                        <a:ext uri="{28A0092B-C50C-407E-A947-70E740481C1C}">
+                          <a14:useLocalDpi xmlns:a14="http://schemas.microsoft.com/office/drawing/2010/main" val="0"/>
+                        </a:ext>
+                      </a:extLst>
+                    </a:blip>
+                    <a:srcRect/>
+                    <a:stretch>
+                      <a:fillRect/>
+                    </a:stretch>
+                  </pic:blipFill>
+                  <pic:spPr bwMode="auto">
+                    <a:xfrm>
+                      <a:off x="0" y="0"/>
+                      <a:ext cx="172720" cy="172720"/>
+                    </a:xfrm>
+                    <a:prstGeom prst="rect">
+                      <a:avLst/>
+                    </a:prstGeom>
+                    <a:noFill/>
+                    <a:ln>
+                      <a:noFill/>
+                    </a:ln>
+                  </pic:spPr>
+                </pic:pic>
+              </a:graphicData>
+            </a:graphic>
+          </wp:inline>
+        </w:drawing>
+      </w:r>
+    </w:p>
+    <w:p>
+      <w:r>
+        <w:t>Casilla donde aparece el J1 y J2 para iniciar el juego</w:t>
+      </w:r>
+    </w:p>
     <w:p>
       <w:pPr>
         <w:tabs>
@@ -1083,7 +1314,7 @@
                     </pic:cNvPicPr>
                   </pic:nvPicPr>
                   <pic:blipFill>
-                    <a:blip r:embed="rId18">
+                    <a:blip r:embed="rId19">
                       <a:extLst>
                         <a:ext uri="{28A0092B-C50C-407E-A947-70E740481C1C}">
                           <a14:useLocalDpi xmlns:a14="http://schemas.microsoft.com/office/drawing/2010/main" val="0"/>
@@ -1167,7 +1398,7 @@
                     </pic:cNvPicPr>
                   </pic:nvPicPr>
                   <pic:blipFill>
-                    <a:blip r:embed="rId19">
+                    <a:blip r:embed="rId20">
                       <a:extLst>
                         <a:ext uri="{28A0092B-C50C-407E-A947-70E740481C1C}">
                           <a14:useLocalDpi xmlns:a14="http://schemas.microsoft.com/office/drawing/2010/main" val="0"/>
@@ -1204,13 +1435,8 @@
         <w:t>Al recogerla te conviertes temporalmente en el tipo</w:t>
       </w:r>
       <w:r>
-        <w:t xml:space="preserve">   Azul: </w:t>
-      </w:r>
-      <w:proofErr w:type="gramStart"/>
-      <w:r>
-        <w:t>más grande y más rápido</w:t>
-      </w:r>
-      <w:proofErr w:type="gramEnd"/>
+        <w:t xml:space="preserve">   Azul: más grande y más rápido</w:t>
+      </w:r>
       <w:r>
         <w:t>,</w:t>
       </w:r>
@@ -1218,18 +1444,9 @@
         <w:t xml:space="preserve"> </w:t>
       </w:r>
       <w:r>
-        <w:t>hasta que muera</w:t>
-      </w:r>
-      <w:r>
-        <w:t xml:space="preserve">s </w:t>
-      </w:r>
-      <w:r>
-        <w:t>o recojas otra moneda especial.</w:t>
-      </w:r>
-    </w:p>
-    <w:p/>
-    <w:p/>
-    <w:p/>
+        <w:t>hasta que mueras o recojas otra moneda especial.</w:t>
+      </w:r>
+    </w:p>
     <w:p/>
     <w:p>
       <w:pPr>
@@ -1238,7 +1455,6 @@
         </w:tabs>
       </w:pPr>
       <w:r>
-        <w:lastRenderedPageBreak/>
         <w:t xml:space="preserve">  Moneda verde</w:t>
       </w:r>
       <w:r>
@@ -1273,7 +1489,7 @@
                     </pic:cNvPicPr>
                   </pic:nvPicPr>
                   <pic:blipFill>
-                    <a:blip r:embed="rId20">
+                    <a:blip r:embed="rId21">
                       <a:extLst>
                         <a:ext uri="{28A0092B-C50C-407E-A947-70E740481C1C}">
                           <a14:useLocalDpi xmlns:a14="http://schemas.microsoft.com/office/drawing/2010/main" val="0"/>
@@ -1322,6 +1538,61 @@
     </w:p>
     <w:p>
       <w:r>
+        <w:rPr>
+          <w:noProof/>
+        </w:rPr>
+        <w:drawing>
+          <wp:inline distT="0" distB="0" distL="0" distR="0" wp14:anchorId="1FA8CE33" wp14:editId="544C440C">
+            <wp:extent cx="171450" cy="171450"/>
+            <wp:effectExtent l="0" t="0" r="0" b="0"/>
+            <wp:docPr id="338885489" name="Imagen 1"/>
+            <wp:cNvGraphicFramePr>
+              <a:graphicFrameLocks xmlns:a="http://schemas.openxmlformats.org/drawingml/2006/main" noChangeAspect="1"/>
+            </wp:cNvGraphicFramePr>
+            <a:graphic xmlns:a="http://schemas.openxmlformats.org/drawingml/2006/main">
+              <a:graphicData uri="http://schemas.openxmlformats.org/drawingml/2006/picture">
+                <pic:pic xmlns:pic="http://schemas.openxmlformats.org/drawingml/2006/picture">
+                  <pic:nvPicPr>
+                    <pic:cNvPr id="0" name="Picture 1"/>
+                    <pic:cNvPicPr>
+                      <a:picLocks noChangeAspect="1" noChangeArrowheads="1"/>
+                    </pic:cNvPicPr>
+                  </pic:nvPicPr>
+                  <pic:blipFill>
+                    <a:blip r:embed="rId22">
+                      <a:extLst>
+                        <a:ext uri="{28A0092B-C50C-407E-A947-70E740481C1C}">
+                          <a14:useLocalDpi xmlns:a14="http://schemas.microsoft.com/office/drawing/2010/main" val="0"/>
+                        </a:ext>
+                      </a:extLst>
+                    </a:blip>
+                    <a:srcRect/>
+                    <a:stretch>
+                      <a:fillRect/>
+                    </a:stretch>
+                  </pic:blipFill>
+                  <pic:spPr bwMode="auto">
+                    <a:xfrm>
+                      <a:off x="0" y="0"/>
+                      <a:ext cx="171450" cy="171450"/>
+                    </a:xfrm>
+                    <a:prstGeom prst="rect">
+                      <a:avLst/>
+                    </a:prstGeom>
+                    <a:noFill/>
+                    <a:ln>
+                      <a:noFill/>
+                    </a:ln>
+                  </pic:spPr>
+                </pic:pic>
+              </a:graphicData>
+            </a:graphic>
+          </wp:inline>
+        </w:drawing>
+      </w:r>
+    </w:p>
+    <w:p>
+      <w:r>
         <w:t xml:space="preserve">  Básico</w:t>
       </w:r>
     </w:p>
@@ -1335,7 +1606,21 @@
       <w:r>
         <w:t>al tocar una pared. Velocidad normal.</w:t>
       </w:r>
-    </w:p>
+      <w:r>
+        <w:t xml:space="preserve"> Se adicionan independientemente con un numero distinto, HorizontalDerecha, HorizontalIzquiera, VerticalDerecha, VerticalIzquierda.</w:t>
+      </w:r>
+    </w:p>
+    <w:p>
+      <w:r>
+        <w:t>Diagonal</w:t>
+      </w:r>
+    </w:p>
+    <w:p>
+      <w:r>
+        <w:t xml:space="preserve">Se desplaza en diagonal, al chocar con pared cambia su dirección </w:t>
+      </w:r>
+    </w:p>
+    <w:p/>
     <w:p/>
     <w:p>
       <w:r>
@@ -1344,15 +1629,7 @@
     </w:p>
     <w:p>
       <w:r>
-        <w:t xml:space="preserve">    Igual que el </w:t>
-      </w:r>
-      <w:proofErr w:type="gramStart"/>
-      <w:r>
-        <w:t>básico</w:t>
-      </w:r>
-      <w:proofErr w:type="gramEnd"/>
-      <w:r>
-        <w:t xml:space="preserve"> pero al doble de velocidad. Reacciona</w:t>
+        <w:t xml:space="preserve">    Igual que el básico pero al doble de velocidad. Reacciona</w:t>
       </w:r>
       <w:r>
         <w:t xml:space="preserve"> </w:t>
@@ -1360,6 +1637,9 @@
       <w:r>
         <w:t>más rápido, esquívalo con cuidado.</w:t>
       </w:r>
+      <w:r>
+        <w:t xml:space="preserve"> Hay horizontal y vertical</w:t>
+      </w:r>
     </w:p>
     <w:p/>
     <w:p>
@@ -1369,6 +1649,45 @@
     </w:p>
     <w:p>
       <w:r>
+        <w:drawing>
+          <wp:inline distT="0" distB="0" distL="0" distR="0" wp14:anchorId="4671191F" wp14:editId="7BDD9CF0">
+            <wp:extent cx="181000" cy="190527"/>
+            <wp:effectExtent l="0" t="0" r="0" b="0"/>
+            <wp:docPr id="256481444" name="Imagen 1"/>
+            <wp:cNvGraphicFramePr>
+              <a:graphicFrameLocks xmlns:a="http://schemas.openxmlformats.org/drawingml/2006/main" noChangeAspect="1"/>
+            </wp:cNvGraphicFramePr>
+            <a:graphic xmlns:a="http://schemas.openxmlformats.org/drawingml/2006/main">
+              <a:graphicData uri="http://schemas.openxmlformats.org/drawingml/2006/picture">
+                <pic:pic xmlns:pic="http://schemas.openxmlformats.org/drawingml/2006/picture">
+                  <pic:nvPicPr>
+                    <pic:cNvPr id="256481444" name=""/>
+                    <pic:cNvPicPr/>
+                  </pic:nvPicPr>
+                  <pic:blipFill>
+                    <a:blip r:embed="rId23"/>
+                    <a:stretch>
+                      <a:fillRect/>
+                    </a:stretch>
+                  </pic:blipFill>
+                  <pic:spPr>
+                    <a:xfrm>
+                      <a:off x="0" y="0"/>
+                      <a:ext cx="181000" cy="190527"/>
+                    </a:xfrm>
+                    <a:prstGeom prst="rect">
+                      <a:avLst/>
+                    </a:prstGeom>
+                  </pic:spPr>
+                </pic:pic>
+              </a:graphicData>
+            </a:graphic>
+          </wp:inline>
+        </w:drawing>
+      </w:r>
+    </w:p>
+    <w:p>
+      <w:r>
         <w:t xml:space="preserve">    Sigue una ruta fija marcada en el nivel, recorriendo las mismas casillas en bucle. Su camino es predecible si lo</w:t>
       </w:r>
       <w:r>
@@ -1402,15 +1721,173 @@
         <w:t>al final del nivel.</w:t>
       </w:r>
     </w:p>
-    <w:p/>
-    <w:p/>
-    <w:p/>
-    <w:p/>
-    <w:p/>
-    <w:p/>
-    <w:p>
-      <w:r>
-        <w:lastRenderedPageBreak/>
+    <w:p>
+      <w:r>
+        <w:t>Fuente de vida</w:t>
+      </w:r>
+    </w:p>
+    <w:p>
+      <w:r>
+        <w:rPr>
+          <w:noProof/>
+        </w:rPr>
+        <w:drawing>
+          <wp:inline distT="0" distB="0" distL="0" distR="0" wp14:anchorId="77F3018A" wp14:editId="408F01BF">
+            <wp:extent cx="198407" cy="198407"/>
+            <wp:effectExtent l="0" t="0" r="0" b="0"/>
+            <wp:docPr id="1111186617" name="Imagen 6"/>
+            <wp:cNvGraphicFramePr>
+              <a:graphicFrameLocks xmlns:a="http://schemas.openxmlformats.org/drawingml/2006/main" noChangeAspect="1"/>
+            </wp:cNvGraphicFramePr>
+            <a:graphic xmlns:a="http://schemas.openxmlformats.org/drawingml/2006/main">
+              <a:graphicData uri="http://schemas.openxmlformats.org/drawingml/2006/picture">
+                <pic:pic xmlns:pic="http://schemas.openxmlformats.org/drawingml/2006/picture">
+                  <pic:nvPicPr>
+                    <pic:cNvPr id="0" name="Picture 11"/>
+                    <pic:cNvPicPr>
+                      <a:picLocks noChangeAspect="1" noChangeArrowheads="1"/>
+                    </pic:cNvPicPr>
+                  </pic:nvPicPr>
+                  <pic:blipFill>
+                    <a:blip r:embed="rId21">
+                      <a:extLst>
+                        <a:ext uri="{28A0092B-C50C-407E-A947-70E740481C1C}">
+                          <a14:useLocalDpi xmlns:a14="http://schemas.microsoft.com/office/drawing/2010/main" val="0"/>
+                        </a:ext>
+                      </a:extLst>
+                    </a:blip>
+                    <a:srcRect/>
+                    <a:stretch>
+                      <a:fillRect/>
+                    </a:stretch>
+                  </pic:blipFill>
+                  <pic:spPr bwMode="auto">
+                    <a:xfrm>
+                      <a:off x="0" y="0"/>
+                      <a:ext cx="199984" cy="199984"/>
+                    </a:xfrm>
+                    <a:prstGeom prst="rect">
+                      <a:avLst/>
+                    </a:prstGeom>
+                    <a:noFill/>
+                    <a:ln>
+                      <a:noFill/>
+                    </a:ln>
+                  </pic:spPr>
+                </pic:pic>
+              </a:graphicData>
+            </a:graphic>
+          </wp:inline>
+        </w:drawing>
+      </w:r>
+    </w:p>
+    <w:p>
+      <w:r>
+        <w:t>Agrega una vida al jugador, se pierde si el jugador colisiona con algún enemigo</w:t>
+      </w:r>
+    </w:p>
+    <w:p>
+      <w:r>
+        <w:t>Bomba</w:t>
+      </w:r>
+    </w:p>
+    <w:p>
+      <w:r>
+        <w:pict w14:anchorId="75E522C8">
+          <v:shapetype id="_x0000_t75" coordsize="21600,21600" o:spt="75" o:preferrelative="t" path="m@4@5l@4@11@9@11@9@5xe" filled="f" stroked="f">
+            <v:stroke joinstyle="miter"/>
+            <v:formulas>
+              <v:f eqn="if lineDrawn pixelLineWidth 0"/>
+              <v:f eqn="sum @0 1 0"/>
+              <v:f eqn="sum 0 0 @1"/>
+              <v:f eqn="prod @2 1 2"/>
+              <v:f eqn="prod @3 21600 pixelWidth"/>
+              <v:f eqn="prod @3 21600 pixelHeight"/>
+              <v:f eqn="sum @0 0 1"/>
+              <v:f eqn="prod @6 1 2"/>
+              <v:f eqn="prod @7 21600 pixelWidth"/>
+              <v:f eqn="sum @8 21600 0"/>
+              <v:f eqn="prod @7 21600 pixelHeight"/>
+              <v:f eqn="sum @10 21600 0"/>
+            </v:formulas>
+            <v:path o:extrusionok="f" gradientshapeok="t" o:connecttype="rect"/>
+            <o:lock v:ext="edit" aspectratio="t"/>
+          </v:shapetype>
+          <v:shape id="Imagen 1" o:spid="_x0000_i1048" type="#_x0000_t75" style="width:13.5pt;height:12pt;visibility:visible;mso-wrap-style:square">
+            <v:imagedata r:id="rId24" o:title=""/>
+          </v:shape>
+        </w:pict>
+      </w:r>
+    </w:p>
+    <w:p>
+      <w:r>
+        <w:t>Disminuye la vida del jugador al colisionar con la bomba</w:t>
+      </w:r>
+    </w:p>
+    <w:p>
+      <w:r>
+        <w:t>WayPoint</w:t>
+      </w:r>
+    </w:p>
+    <w:p>
+      <w:r>
+        <w:drawing>
+          <wp:inline distT="0" distB="0" distL="0" distR="0" wp14:anchorId="6809F547" wp14:editId="611381C7">
+            <wp:extent cx="161948" cy="142895"/>
+            <wp:effectExtent l="0" t="0" r="9525" b="9525"/>
+            <wp:docPr id="914290128" name="Imagen 1"/>
+            <wp:cNvGraphicFramePr>
+              <a:graphicFrameLocks xmlns:a="http://schemas.openxmlformats.org/drawingml/2006/main" noChangeAspect="1"/>
+            </wp:cNvGraphicFramePr>
+            <a:graphic xmlns:a="http://schemas.openxmlformats.org/drawingml/2006/main">
+              <a:graphicData uri="http://schemas.openxmlformats.org/drawingml/2006/picture">
+                <pic:pic xmlns:pic="http://schemas.openxmlformats.org/drawingml/2006/picture">
+                  <pic:nvPicPr>
+                    <pic:cNvPr id="914290128" name=""/>
+                    <pic:cNvPicPr/>
+                  </pic:nvPicPr>
+                  <pic:blipFill>
+                    <a:blip r:embed="rId25"/>
+                    <a:stretch>
+                      <a:fillRect/>
+                    </a:stretch>
+                  </pic:blipFill>
+                  <pic:spPr>
+                    <a:xfrm>
+                      <a:off x="0" y="0"/>
+                      <a:ext cx="161948" cy="142895"/>
+                    </a:xfrm>
+                    <a:prstGeom prst="rect">
+                      <a:avLst/>
+                    </a:prstGeom>
+                  </pic:spPr>
+                </pic:pic>
+              </a:graphicData>
+            </a:graphic>
+          </wp:inline>
+        </w:drawing>
+      </w:r>
+    </w:p>
+    <w:p>
+      <w:r>
+        <w:t>E</w:t>
+      </w:r>
+      <w:r>
+        <w:t xml:space="preserve">l recorrido que hace el patrullero, pero va primero de izquierda a derecha, de arriba </w:t>
+      </w:r>
+      <w:r>
+        <w:t>abajo. Debe ponerse en el nivel junto con el patrullero</w:t>
+      </w:r>
+    </w:p>
+    <w:p/>
+    <w:p/>
+    <w:p/>
+    <w:p/>
+    <w:p/>
+    <w:p/>
+    <w:p/>
+    <w:p>
+      <w:r>
         <w:t xml:space="preserve">  PUNTAJE</w:t>
       </w:r>
     </w:p>
@@ -1454,6 +1931,9 @@
     </w:p>
     <w:p>
       <w:r>
+        <w:rPr>
+          <w:noProof/>
+        </w:rPr>
         <w:drawing>
           <wp:inline distT="0" distB="0" distL="0" distR="0" wp14:anchorId="47A77F60" wp14:editId="7FCE51A0">
             <wp:extent cx="3867690" cy="1267002"/>
@@ -1470,7 +1950,7 @@
                     <pic:cNvPicPr/>
                   </pic:nvPicPr>
                   <pic:blipFill>
-                    <a:blip r:embed="rId21"/>
+                    <a:blip r:embed="rId26"/>
                     <a:stretch>
                       <a:fillRect/>
                     </a:stretch>
@@ -1528,7 +2008,6 @@
     <w:p/>
     <w:p>
       <w:r>
-        <w:lastRenderedPageBreak/>
         <w:t xml:space="preserve">  GUARDAR Y CARGAR PARTIDA</w:t>
       </w:r>
     </w:p>
@@ -1539,6 +2018,9 @@
     </w:p>
     <w:p>
       <w:r>
+        <w:rPr>
+          <w:noProof/>
+        </w:rPr>
         <w:drawing>
           <wp:inline distT="0" distB="0" distL="0" distR="0" wp14:anchorId="67115AF5" wp14:editId="7D1AC426">
             <wp:extent cx="3347049" cy="2543045"/>
@@ -1555,7 +2037,7 @@
                     <pic:cNvPicPr/>
                   </pic:nvPicPr>
                   <pic:blipFill>
-                    <a:blip r:embed="rId22"/>
+                    <a:blip r:embed="rId27"/>
                     <a:stretch>
                       <a:fillRect/>
                     </a:stretch>
@@ -1578,6 +2060,9 @@
     </w:p>
     <w:p>
       <w:r>
+        <w:rPr>
+          <w:noProof/>
+        </w:rPr>
         <w:drawing>
           <wp:inline distT="0" distB="0" distL="0" distR="0" wp14:anchorId="743665AC" wp14:editId="65E766AD">
             <wp:extent cx="1047896" cy="1390844"/>
@@ -1594,7 +2079,7 @@
                     <pic:cNvPicPr/>
                   </pic:nvPicPr>
                   <pic:blipFill>
-                    <a:blip r:embed="rId23"/>
+                    <a:blip r:embed="rId28"/>
                     <a:stretch>
                       <a:fillRect/>
                     </a:stretch>
@@ -1623,29 +2108,13 @@
         <w:t xml:space="preserve"> </w:t>
       </w:r>
       <w:r>
-        <w:t>tu partida (se guarda como archivo .</w:t>
-      </w:r>
-      <w:proofErr w:type="spellStart"/>
-      <w:r>
-        <w:t>dat</w:t>
-      </w:r>
-      <w:proofErr w:type="spellEnd"/>
-      <w:r>
-        <w:t>).</w:t>
-      </w:r>
-    </w:p>
-    <w:p/>
-    <w:p>
-      <w:r>
-        <w:t xml:space="preserve">  Cargar    Abre un selector de archivo. Elige un archivo .</w:t>
-      </w:r>
-      <w:proofErr w:type="spellStart"/>
-      <w:r>
-        <w:t>dat</w:t>
-      </w:r>
-      <w:proofErr w:type="spellEnd"/>
-      <w:r>
-        <w:t xml:space="preserve"> guardado previamente para continuar desde donde</w:t>
+        <w:t>tu partida (se guarda como archivo .dat).</w:t>
+      </w:r>
+    </w:p>
+    <w:p/>
+    <w:p>
+      <w:r>
+        <w:t xml:space="preserve">  Cargar    Abre un selector de archivo. Elige un archivo .dat guardado previamente para continuar desde donde</w:t>
       </w:r>
       <w:r>
         <w:t xml:space="preserve"> </w:t>
@@ -1669,6 +2138,7 @@
     <w:p/>
     <w:p>
       <w:r>
+        <w:lastRenderedPageBreak/>
         <w:t>La partida guarda: nivel actual, posición, monedas recogidas,</w:t>
       </w:r>
       <w:r>
@@ -1681,189 +2151,144 @@
     <w:p/>
     <w:p>
       <w:r>
+        <w:t xml:space="preserve">  PAUSA</w:t>
+      </w:r>
+    </w:p>
+    <w:p>
+      <w:r>
+        <w:t>Presiona ESC en cualquier momento para pausar el juego.</w:t>
+      </w:r>
+    </w:p>
+    <w:p>
+      <w:r>
+        <w:t>Los enemigos y el temporizador se detienen completamente.</w:t>
+      </w:r>
+    </w:p>
+    <w:p/>
+    <w:p>
+      <w:r>
+        <w:t xml:space="preserve">  ESC            Reanudar el juego.</w:t>
+      </w:r>
+    </w:p>
+    <w:p>
+      <w:r>
+        <w:t xml:space="preserve">  M              Volver al menú principal.</w:t>
+      </w:r>
+    </w:p>
+    <w:p>
+      <w:r>
+        <w:t xml:space="preserve">  Opciones → Pausar   También puedes pausar desde el </w:t>
+      </w:r>
+      <w:r>
+        <w:t>menú</w:t>
+      </w:r>
+      <w:r>
+        <w:t xml:space="preserve"> usando el ratón.</w:t>
+      </w:r>
+    </w:p>
+    <w:p/>
+    <w:p>
+      <w:r>
+        <w:t xml:space="preserve">  CÓMO CREAR TUS PROPIOS NIVELES</w:t>
+      </w:r>
+    </w:p>
+    <w:p>
+      <w:r>
+        <w:t>Los niveles son archivos de texto (.txt) que puedes edita</w:t>
+      </w:r>
+      <w:r>
+        <w:t xml:space="preserve">r </w:t>
+      </w:r>
+      <w:r>
+        <w:t>con cualquier editor (Bloc de notas, VS Code, etc.).</w:t>
+      </w:r>
+    </w:p>
+    <w:p/>
+    <w:p>
+      <w:r>
+        <w:t>Cada nivel es una cuadrícula de 25 filas por 33 columnas.</w:t>
+      </w:r>
+    </w:p>
+    <w:p>
+      <w:r>
+        <w:t>Cada celda tiene un código que indica qué hay ahí:</w:t>
+      </w:r>
+    </w:p>
+    <w:p/>
+    <w:p>
+      <w:r>
+        <w:t xml:space="preserve">  3   Pared / vacío (el jugador no puede pasar)</w:t>
+      </w:r>
+    </w:p>
+    <w:p>
+      <w:r>
+        <w:t xml:space="preserve">  0   Suelo (variante A)</w:t>
+      </w:r>
+    </w:p>
+    <w:p>
+      <w:r>
+        <w:t xml:space="preserve">  1   Suelo (variante B, alterna con 0 para el patrón damero)</w:t>
+      </w:r>
+    </w:p>
+    <w:p>
+      <w:r>
+        <w:t xml:space="preserve">  5   Moneda amarilla</w:t>
+      </w:r>
+    </w:p>
+    <w:p>
+      <w:r>
+        <w:t xml:space="preserve">  6   Posición de inicio del Jugador 1  ← obligatorio</w:t>
+      </w:r>
+    </w:p>
+    <w:p>
+      <w:r>
+        <w:t xml:space="preserve">  7   Posición de inicio del Jugador 2  (solo en mapas 2p)</w:t>
+      </w:r>
+    </w:p>
+    <w:p>
+      <w:r>
+        <w:t xml:space="preserve">  2   Meta final                        ← obligatorio</w:t>
+      </w:r>
+    </w:p>
+    <w:p>
+      <w:r>
+        <w:t xml:space="preserve">  4   Punto de control (checkpoint)</w:t>
+      </w:r>
+    </w:p>
+    <w:p>
+      <w:r>
+        <w:t>8 Enemigo H(derecha)</w:t>
+      </w:r>
+    </w:p>
+    <w:p>
+      <w:r>
         <w:lastRenderedPageBreak/>
-        <w:t xml:space="preserve">  PAUSA</w:t>
-      </w:r>
-    </w:p>
-    <w:p>
-      <w:r>
-        <w:t>Presiona ESC en cualquier momento para pausar el juego.</w:t>
-      </w:r>
-    </w:p>
-    <w:p>
-      <w:r>
-        <w:t>Los enemigos y el temporizador se detienen completamente.</w:t>
-      </w:r>
-    </w:p>
-    <w:p/>
-    <w:p>
-      <w:r>
-        <w:t xml:space="preserve">  ESC            Reanudar el juego.</w:t>
-      </w:r>
-    </w:p>
-    <w:p>
-      <w:r>
-        <w:t xml:space="preserve">  M              Volver al menú principal.</w:t>
-      </w:r>
-    </w:p>
-    <w:p>
-      <w:r>
-        <w:t xml:space="preserve">  Opciones → Pausar   También puedes pausar desde el </w:t>
-      </w:r>
-      <w:r>
-        <w:t>menú</w:t>
-      </w:r>
-      <w:r>
-        <w:t xml:space="preserve"> usando el ratón.</w:t>
-      </w:r>
-    </w:p>
-    <w:p/>
-    <w:p>
-      <w:r>
-        <w:t xml:space="preserve">  CÓMO CREAR TUS PROPIOS NIVELES</w:t>
-      </w:r>
-    </w:p>
-    <w:p>
-      <w:r>
-        <w:t>Los niveles son archivos de texto (.</w:t>
-      </w:r>
-      <w:proofErr w:type="spellStart"/>
-      <w:r>
-        <w:t>txt</w:t>
-      </w:r>
-      <w:proofErr w:type="spellEnd"/>
-      <w:r>
-        <w:t>) que puedes edita</w:t>
-      </w:r>
-      <w:r>
-        <w:t xml:space="preserve">r </w:t>
-      </w:r>
-      <w:r>
-        <w:t>con cualquier editor (Bloc de notas, VS Code, etc.).</w:t>
-      </w:r>
-    </w:p>
-    <w:p/>
-    <w:p>
-      <w:r>
-        <w:t>Cada nivel es una cuadrícula de 25 filas por 33 columnas.</w:t>
-      </w:r>
-    </w:p>
-    <w:p>
-      <w:r>
-        <w:t>Cada celda tiene un código que indica qué hay ahí:</w:t>
-      </w:r>
-    </w:p>
-    <w:p/>
-    <w:p>
-      <w:r>
-        <w:t xml:space="preserve">  3   </w:t>
-      </w:r>
-      <w:proofErr w:type="gramStart"/>
-      <w:r>
-        <w:t>Pared</w:t>
-      </w:r>
-      <w:proofErr w:type="gramEnd"/>
-      <w:r>
-        <w:t xml:space="preserve"> / vacío (el jugador no puede pasar)</w:t>
-      </w:r>
-    </w:p>
-    <w:p>
-      <w:r>
-        <w:t xml:space="preserve">  0   </w:t>
-      </w:r>
-      <w:proofErr w:type="gramStart"/>
-      <w:r>
-        <w:t>Suelo</w:t>
-      </w:r>
-      <w:proofErr w:type="gramEnd"/>
-      <w:r>
-        <w:t xml:space="preserve"> (variante A)</w:t>
-      </w:r>
-    </w:p>
-    <w:p>
-      <w:r>
-        <w:t xml:space="preserve">  1   </w:t>
-      </w:r>
-      <w:proofErr w:type="gramStart"/>
-      <w:r>
-        <w:t>Suelo</w:t>
-      </w:r>
-      <w:proofErr w:type="gramEnd"/>
-      <w:r>
-        <w:t xml:space="preserve"> (variante B, alterna con 0 para el patrón damero)</w:t>
-      </w:r>
-    </w:p>
-    <w:p>
-      <w:r>
-        <w:t xml:space="preserve">  5   Moneda amarilla</w:t>
-      </w:r>
-    </w:p>
-    <w:p>
-      <w:r>
-        <w:t xml:space="preserve">  6   </w:t>
-      </w:r>
-      <w:proofErr w:type="gramStart"/>
-      <w:r>
-        <w:t>Posición</w:t>
-      </w:r>
-      <w:proofErr w:type="gramEnd"/>
-      <w:r>
-        <w:t xml:space="preserve"> de inicio del Jugador </w:t>
-      </w:r>
-      <w:proofErr w:type="gramStart"/>
-      <w:r>
-        <w:t>1  ←</w:t>
-      </w:r>
-      <w:proofErr w:type="gramEnd"/>
-      <w:r>
-        <w:t xml:space="preserve"> obligatorio</w:t>
-      </w:r>
-    </w:p>
-    <w:p>
-      <w:r>
-        <w:t xml:space="preserve">  7   </w:t>
-      </w:r>
-      <w:proofErr w:type="gramStart"/>
-      <w:r>
-        <w:t>Posición</w:t>
-      </w:r>
-      <w:proofErr w:type="gramEnd"/>
-      <w:r>
-        <w:t xml:space="preserve"> de inicio del Jugador </w:t>
-      </w:r>
-      <w:proofErr w:type="gramStart"/>
-      <w:r>
-        <w:t>2  (</w:t>
-      </w:r>
-      <w:proofErr w:type="gramEnd"/>
-      <w:r>
-        <w:t>solo en mapas 2p)</w:t>
-      </w:r>
-    </w:p>
-    <w:p>
-      <w:r>
-        <w:t xml:space="preserve">  2   Meta final                        ← obligatorio</w:t>
-      </w:r>
-    </w:p>
-    <w:p>
-      <w:r>
-        <w:t xml:space="preserve">  4   </w:t>
-      </w:r>
-      <w:proofErr w:type="gramStart"/>
-      <w:r>
-        <w:t>Punto</w:t>
-      </w:r>
-      <w:proofErr w:type="gramEnd"/>
-      <w:r>
-        <w:t xml:space="preserve"> de control (</w:t>
-      </w:r>
-      <w:proofErr w:type="spellStart"/>
-      <w:r>
-        <w:t>checkpoint</w:t>
-      </w:r>
-      <w:proofErr w:type="spellEnd"/>
-      <w:r>
-        <w:t>)</w:t>
+        <w:t>9 Enemiho H(izq)</w:t>
+      </w:r>
+    </w:p>
+    <w:p>
+      <w:r>
+        <w:t>A Enemigo V(abajo)</w:t>
+      </w:r>
+    </w:p>
+    <w:p>
+      <w:r>
+        <w:t>B Enemigo V(arriba)</w:t>
+      </w:r>
+    </w:p>
+    <w:p>
+      <w:r>
+        <w:t>C Diagonal</w:t>
+      </w:r>
+    </w:p>
+    <w:p>
+      <w:r>
+        <w:t>D Acelerado H</w:t>
+      </w:r>
+    </w:p>
+    <w:p>
+      <w:r>
+        <w:t>E Acelerado V</w:t>
       </w:r>
     </w:p>
     <w:p>
@@ -1881,59 +2306,16 @@
         <w:t xml:space="preserve">  H   Moneda verde</w:t>
       </w:r>
     </w:p>
-    <w:p/>
-    <w:p>
-      <w:r>
-        <w:t xml:space="preserve">  Enemigos:</w:t>
-      </w:r>
-    </w:p>
-    <w:p>
-      <w:r>
-        <w:t xml:space="preserve">  8   </w:t>
-      </w:r>
-      <w:proofErr w:type="gramStart"/>
-      <w:r>
-        <w:t>Enemigo</w:t>
-      </w:r>
-      <w:proofErr w:type="gramEnd"/>
-      <w:r>
-        <w:t xml:space="preserve"> básico que se mueve hacia la derecha</w:t>
-      </w:r>
-    </w:p>
-    <w:p>
-      <w:r>
-        <w:t xml:space="preserve">  9   </w:t>
-      </w:r>
-      <w:proofErr w:type="gramStart"/>
-      <w:r>
-        <w:t>Enemigo</w:t>
-      </w:r>
-      <w:proofErr w:type="gramEnd"/>
-      <w:r>
-        <w:t xml:space="preserve"> básico que se mueve hacia la izquierda</w:t>
-      </w:r>
-    </w:p>
-    <w:p>
-      <w:r>
-        <w:t xml:space="preserve">  A   Enemigo básico que se mueve hacia abajo</w:t>
-      </w:r>
-    </w:p>
-    <w:p>
-      <w:r>
-        <w:t xml:space="preserve">  B   Enemigo básico que se mueve hacia arriba</w:t>
-      </w:r>
-    </w:p>
-    <w:p>
-      <w:r>
-        <w:t xml:space="preserve">  D   Enemigo acelerado hacia la derecha (doble velocidad)</w:t>
-      </w:r>
-    </w:p>
-    <w:p>
-      <w:r>
-        <w:t xml:space="preserve">  E   Enemigo acelerado hacia abajo (doble velocidad)</w:t>
-      </w:r>
-    </w:p>
-    <w:p/>
+    <w:p>
+      <w:r>
+        <w:t>I Fuente de vida</w:t>
+      </w:r>
+    </w:p>
+    <w:p>
+      <w:r>
+        <w:t>J Bomba</w:t>
+      </w:r>
+    </w:p>
     <w:p>
       <w:r>
         <w:t xml:space="preserve">  Patrullero (necesita dos tipos de código):</w:t>
@@ -1943,26 +2325,22 @@
       <w:r>
         <w:t xml:space="preserve">  C</w:t>
       </w:r>
-      <w:proofErr w:type="gramStart"/>
-      <w:r>
-        <w:t>1  Posición</w:t>
-      </w:r>
-      <w:proofErr w:type="gramEnd"/>
-      <w:r>
-        <w:t xml:space="preserve"> donde aparece el patrullero del grupo 1</w:t>
+      <w:r>
+        <w:t>n</w:t>
+      </w:r>
+      <w:r>
+        <w:t xml:space="preserve">  Posición donde aparece el patrullero del grupo 1</w:t>
       </w:r>
     </w:p>
     <w:p>
       <w:r>
         <w:t xml:space="preserve">  P</w:t>
       </w:r>
-      <w:proofErr w:type="gramStart"/>
-      <w:r>
-        <w:t>1  Casilla</w:t>
-      </w:r>
-      <w:proofErr w:type="gramEnd"/>
-      <w:r>
-        <w:t xml:space="preserve"> que patrulla el grupo 1</w:t>
+      <w:r>
+        <w:t>n</w:t>
+      </w:r>
+      <w:r>
+        <w:t xml:space="preserve">  Casilla que patrulla el grupo 1</w:t>
       </w:r>
     </w:p>
     <w:p>
@@ -1978,187 +2356,27 @@
     <w:p/>
     <w:p>
       <w:r>
-        <w:t xml:space="preserve">  </w:t>
-      </w:r>
-      <w:proofErr w:type="gramStart"/>
-      <w:r>
-        <w:t>3  3</w:t>
-      </w:r>
-      <w:proofErr w:type="gramEnd"/>
-      <w:r>
-        <w:t xml:space="preserve">  </w:t>
-      </w:r>
-      <w:proofErr w:type="gramStart"/>
-      <w:r>
-        <w:t>3  3</w:t>
-      </w:r>
-      <w:proofErr w:type="gramEnd"/>
-      <w:r>
-        <w:t xml:space="preserve">  </w:t>
-      </w:r>
-      <w:proofErr w:type="gramStart"/>
-      <w:r>
-        <w:t>3  3</w:t>
-      </w:r>
-      <w:proofErr w:type="gramEnd"/>
-      <w:r>
-        <w:t xml:space="preserve">  </w:t>
-      </w:r>
-      <w:proofErr w:type="gramStart"/>
-      <w:r>
-        <w:t>3  3</w:t>
-      </w:r>
-      <w:proofErr w:type="gramEnd"/>
-      <w:r>
-        <w:t xml:space="preserve">  3</w:t>
-      </w:r>
-    </w:p>
-    <w:p>
-      <w:r>
-        <w:t xml:space="preserve">  </w:t>
-      </w:r>
-      <w:proofErr w:type="gramStart"/>
-      <w:r>
-        <w:t>3  0</w:t>
-      </w:r>
-      <w:proofErr w:type="gramEnd"/>
-      <w:r>
-        <w:t xml:space="preserve">  </w:t>
-      </w:r>
-      <w:proofErr w:type="gramStart"/>
-      <w:r>
-        <w:t>1  0</w:t>
-      </w:r>
-      <w:proofErr w:type="gramEnd"/>
-      <w:r>
-        <w:t xml:space="preserve">  </w:t>
-      </w:r>
-      <w:proofErr w:type="gramStart"/>
-      <w:r>
-        <w:t>5  0</w:t>
-      </w:r>
-      <w:proofErr w:type="gramEnd"/>
-      <w:r>
-        <w:t xml:space="preserve">  </w:t>
-      </w:r>
-      <w:proofErr w:type="gramStart"/>
-      <w:r>
-        <w:t>1  0</w:t>
-      </w:r>
-      <w:proofErr w:type="gramEnd"/>
-      <w:r>
-        <w:t xml:space="preserve">  3</w:t>
-      </w:r>
-    </w:p>
-    <w:p>
-      <w:r>
-        <w:t xml:space="preserve">  </w:t>
-      </w:r>
-      <w:proofErr w:type="gramStart"/>
-      <w:r>
-        <w:t>3  1</w:t>
-      </w:r>
-      <w:proofErr w:type="gramEnd"/>
-      <w:r>
-        <w:t xml:space="preserve">  </w:t>
-      </w:r>
-      <w:proofErr w:type="gramStart"/>
-      <w:r>
-        <w:t>0  1</w:t>
-      </w:r>
-      <w:proofErr w:type="gramEnd"/>
-      <w:r>
-        <w:t xml:space="preserve">  </w:t>
-      </w:r>
-      <w:proofErr w:type="gramStart"/>
-      <w:r>
-        <w:t>0  1</w:t>
-      </w:r>
-      <w:proofErr w:type="gramEnd"/>
-      <w:r>
-        <w:t xml:space="preserve">  </w:t>
-      </w:r>
-      <w:proofErr w:type="gramStart"/>
-      <w:r>
-        <w:t>0  6</w:t>
-      </w:r>
-      <w:proofErr w:type="gramEnd"/>
-      <w:r>
-        <w:t xml:space="preserve">  3</w:t>
-      </w:r>
-    </w:p>
-    <w:p>
-      <w:r>
-        <w:t xml:space="preserve">  </w:t>
-      </w:r>
-      <w:proofErr w:type="gramStart"/>
-      <w:r>
-        <w:t>3  0</w:t>
-      </w:r>
-      <w:proofErr w:type="gramEnd"/>
-      <w:r>
-        <w:t xml:space="preserve">  </w:t>
-      </w:r>
-      <w:proofErr w:type="gramStart"/>
-      <w:r>
-        <w:t>1  8</w:t>
-      </w:r>
-      <w:proofErr w:type="gramEnd"/>
-      <w:r>
-        <w:t xml:space="preserve">  </w:t>
-      </w:r>
-      <w:proofErr w:type="gramStart"/>
-      <w:r>
-        <w:t>1  0</w:t>
-      </w:r>
-      <w:proofErr w:type="gramEnd"/>
-      <w:r>
-        <w:t xml:space="preserve">  </w:t>
-      </w:r>
-      <w:proofErr w:type="gramStart"/>
-      <w:r>
-        <w:t>1  0</w:t>
-      </w:r>
-      <w:proofErr w:type="gramEnd"/>
-      <w:r>
-        <w:t xml:space="preserve">  3</w:t>
-      </w:r>
-    </w:p>
-    <w:p>
-      <w:r>
-        <w:t xml:space="preserve">  </w:t>
-      </w:r>
-      <w:proofErr w:type="gramStart"/>
-      <w:r>
-        <w:t>3  3</w:t>
-      </w:r>
-      <w:proofErr w:type="gramEnd"/>
-      <w:r>
-        <w:t xml:space="preserve">  </w:t>
-      </w:r>
-      <w:proofErr w:type="gramStart"/>
-      <w:r>
-        <w:t>3  3</w:t>
-      </w:r>
-      <w:proofErr w:type="gramEnd"/>
-      <w:r>
-        <w:t xml:space="preserve">  </w:t>
-      </w:r>
-      <w:proofErr w:type="gramStart"/>
-      <w:r>
-        <w:t>2  3</w:t>
-      </w:r>
-      <w:proofErr w:type="gramEnd"/>
-      <w:r>
-        <w:t xml:space="preserve">  </w:t>
-      </w:r>
-      <w:proofErr w:type="gramStart"/>
-      <w:r>
-        <w:t>3  3</w:t>
-      </w:r>
-      <w:proofErr w:type="gramEnd"/>
-      <w:r>
-        <w:t xml:space="preserve">  3</w:t>
+        <w:t xml:space="preserve">  3  3  3  3  3  3  3  3  3</w:t>
+      </w:r>
+    </w:p>
+    <w:p>
+      <w:r>
+        <w:t xml:space="preserve">  3  0  1  0  5  0  1  0  3</w:t>
+      </w:r>
+    </w:p>
+    <w:p>
+      <w:r>
+        <w:t xml:space="preserve">  3  1  0  1  0  1  0  6  3</w:t>
+      </w:r>
+    </w:p>
+    <w:p>
+      <w:r>
+        <w:t xml:space="preserve">  3  0  1  8  1  0  1  0  3</w:t>
+      </w:r>
+    </w:p>
+    <w:p>
+      <w:r>
+        <w:t xml:space="preserve">  3  3  3  3  2  3  3  3  3</w:t>
       </w:r>
     </w:p>
     <w:p/>
@@ -2179,6 +2397,7 @@
     </w:p>
     <w:p>
       <w:r>
+        <w:lastRenderedPageBreak/>
         <w:t xml:space="preserve">  - Un enemigo que se mueve a la derecha (8)</w:t>
       </w:r>
     </w:p>
@@ -2189,17 +2408,14 @@
     </w:p>
     <w:p>
       <w:r>
-        <w:lastRenderedPageBreak/>
-        <w:t xml:space="preserve">Mapa del nivel 1 en </w:t>
-      </w:r>
-      <w:proofErr w:type="spellStart"/>
-      <w:r>
-        <w:t>txt</w:t>
-      </w:r>
-      <w:proofErr w:type="spellEnd"/>
-    </w:p>
-    <w:p>
-      <w:r>
+        <w:t>Mapa del nivel 1 en txt</w:t>
+      </w:r>
+    </w:p>
+    <w:p>
+      <w:r>
+        <w:rPr>
+          <w:noProof/>
+        </w:rPr>
         <w:drawing>
           <wp:inline distT="0" distB="0" distL="0" distR="0" wp14:anchorId="6735C32F" wp14:editId="47691286">
             <wp:extent cx="3262968" cy="1173192"/>
@@ -2216,7 +2432,7 @@
                     <pic:cNvPicPr/>
                   </pic:nvPicPr>
                   <pic:blipFill rotWithShape="1">
-                    <a:blip r:embed="rId24"/>
+                    <a:blip r:embed="rId29"/>
                     <a:srcRect t="28111" b="27423"/>
                     <a:stretch>
                       <a:fillRect/>
@@ -2256,6 +2472,9 @@
     </w:p>
     <w:p>
       <w:r>
+        <w:rPr>
+          <w:noProof/>
+        </w:rPr>
         <w:drawing>
           <wp:inline distT="0" distB="0" distL="0" distR="0" wp14:anchorId="0C132F94" wp14:editId="2ED795A1">
             <wp:extent cx="3200400" cy="976175"/>
@@ -2335,15 +2554,7 @@
     </w:p>
     <w:p>
       <w:r>
-        <w:t xml:space="preserve">  level1.txt </w:t>
-      </w:r>
-      <w:proofErr w:type="gramStart"/>
-      <w:r>
-        <w:t xml:space="preserve">   (</w:t>
-      </w:r>
-      <w:proofErr w:type="gramEnd"/>
-      <w:r>
-        <w:t>un jugador, nivel 1)</w:t>
+        <w:t xml:space="preserve">  level1.txt    (un jugador, nivel 1)</w:t>
       </w:r>
     </w:p>
     <w:p>
@@ -2358,19 +2569,15 @@
     </w:p>
     <w:p>
       <w:r>
-        <w:t>Colócalos en la carpeta:  res/</w:t>
-      </w:r>
-      <w:proofErr w:type="spellStart"/>
-      <w:r>
-        <w:t>maps</w:t>
-      </w:r>
-      <w:proofErr w:type="spellEnd"/>
-      <w:r>
-        <w:t>/</w:t>
-      </w:r>
-    </w:p>
-    <w:p>
-      <w:r>
+        <w:t>Colócalos en la carpeta:  res/maps/</w:t>
+      </w:r>
+    </w:p>
+    <w:p>
+      <w:r>
+        <w:rPr>
+          <w:noProof/>
+        </w:rPr>
+        <w:lastRenderedPageBreak/>
         <w:drawing>
           <wp:inline distT="0" distB="0" distL="0" distR="0" wp14:anchorId="0089BA29" wp14:editId="555200F7">
             <wp:extent cx="1142363" cy="1673525"/>
@@ -2387,7 +2594,7 @@
                     <pic:cNvPicPr/>
                   </pic:nvPicPr>
                   <pic:blipFill>
-                    <a:blip r:embed="rId25"/>
+                    <a:blip r:embed="rId30"/>
                     <a:stretch>
                       <a:fillRect/>
                     </a:stretch>
@@ -2409,6 +2616,122 @@
       </w:r>
     </w:p>
     <w:p/>
+    <w:p>
+      <w:r>
+        <w:t>Otra forma de crear el nivel es con el editor de niveles</w:t>
+      </w:r>
+    </w:p>
+    <w:p>
+      <w:r>
+        <w:drawing>
+          <wp:inline distT="0" distB="0" distL="0" distR="0" wp14:anchorId="3754F5E3" wp14:editId="5F71FF25">
+            <wp:extent cx="2724150" cy="1904871"/>
+            <wp:effectExtent l="0" t="0" r="0" b="635"/>
+            <wp:docPr id="1128637776" name="Imagen 1"/>
+            <wp:cNvGraphicFramePr>
+              <a:graphicFrameLocks xmlns:a="http://schemas.openxmlformats.org/drawingml/2006/main" noChangeAspect="1"/>
+            </wp:cNvGraphicFramePr>
+            <a:graphic xmlns:a="http://schemas.openxmlformats.org/drawingml/2006/main">
+              <a:graphicData uri="http://schemas.openxmlformats.org/drawingml/2006/picture">
+                <pic:pic xmlns:pic="http://schemas.openxmlformats.org/drawingml/2006/picture">
+                  <pic:nvPicPr>
+                    <pic:cNvPr id="1128637776" name=""/>
+                    <pic:cNvPicPr/>
+                  </pic:nvPicPr>
+                  <pic:blipFill>
+                    <a:blip r:embed="rId31"/>
+                    <a:stretch>
+                      <a:fillRect/>
+                    </a:stretch>
+                  </pic:blipFill>
+                  <pic:spPr>
+                    <a:xfrm>
+                      <a:off x="0" y="0"/>
+                      <a:ext cx="2740223" cy="1916110"/>
+                    </a:xfrm>
+                    <a:prstGeom prst="rect">
+                      <a:avLst/>
+                    </a:prstGeom>
+                  </pic:spPr>
+                </pic:pic>
+              </a:graphicData>
+            </a:graphic>
+          </wp:inline>
+        </w:drawing>
+      </w:r>
+    </w:p>
+    <w:p>
+      <w:r>
+        <w:t>En la parte izquierda está el tablero limpio para empezar a colocar los objetos del nuevo mapa</w:t>
+      </w:r>
+    </w:p>
+    <w:p>
+      <w:r>
+        <w:rPr>
+          <w:noProof/>
+        </w:rPr>
+        <w:drawing>
+          <wp:inline distT="0" distB="0" distL="0" distR="0" wp14:anchorId="1D308B5E" wp14:editId="0581B9DC">
+            <wp:extent cx="3079796" cy="2152650"/>
+            <wp:effectExtent l="0" t="0" r="6350" b="0"/>
+            <wp:docPr id="1231127234" name="Imagen 4"/>
+            <wp:cNvGraphicFramePr>
+              <a:graphicFrameLocks xmlns:a="http://schemas.openxmlformats.org/drawingml/2006/main" noChangeAspect="1"/>
+            </wp:cNvGraphicFramePr>
+            <a:graphic xmlns:a="http://schemas.openxmlformats.org/drawingml/2006/main">
+              <a:graphicData uri="http://schemas.openxmlformats.org/drawingml/2006/picture">
+                <pic:pic xmlns:pic="http://schemas.openxmlformats.org/drawingml/2006/picture">
+                  <pic:nvPicPr>
+                    <pic:cNvPr id="0" name="Picture 2"/>
+                    <pic:cNvPicPr>
+                      <a:picLocks noChangeAspect="1" noChangeArrowheads="1"/>
+                    </pic:cNvPicPr>
+                  </pic:nvPicPr>
+                  <pic:blipFill>
+                    <a:blip r:embed="rId32" cstate="print">
+                      <a:extLst>
+                        <a:ext uri="{28A0092B-C50C-407E-A947-70E740481C1C}">
+                          <a14:useLocalDpi xmlns:a14="http://schemas.microsoft.com/office/drawing/2010/main" val="0"/>
+                        </a:ext>
+                      </a:extLst>
+                    </a:blip>
+                    <a:srcRect/>
+                    <a:stretch>
+                      <a:fillRect/>
+                    </a:stretch>
+                  </pic:blipFill>
+                  <pic:spPr bwMode="auto">
+                    <a:xfrm>
+                      <a:off x="0" y="0"/>
+                      <a:ext cx="3101229" cy="2167631"/>
+                    </a:xfrm>
+                    <a:prstGeom prst="rect">
+                      <a:avLst/>
+                    </a:prstGeom>
+                    <a:noFill/>
+                  </pic:spPr>
+                </pic:pic>
+              </a:graphicData>
+            </a:graphic>
+          </wp:inline>
+        </w:drawing>
+      </w:r>
+    </w:p>
+    <w:p>
+      <w:r>
+        <w:t>Se colocan seleccionando el objeto y después presionando la casilla donde se desea</w:t>
+      </w:r>
+    </w:p>
+    <w:p>
+      <w:r>
+        <w:t>Para cambiar el que se coloco solo debe seleccionarse otro y ponerlo encima</w:t>
+      </w:r>
+    </w:p>
+    <w:p>
+      <w:r>
+        <w:t xml:space="preserve">Luego se guarda y se puede utilizar en el juego cuando se vuelva a cargar la aplicación </w:t>
+      </w:r>
+    </w:p>
     <w:p/>
     <w:p>
       <w:r>
@@ -2428,15 +2751,7 @@
     <w:p/>
     <w:p>
       <w:r>
-        <w:t xml:space="preserve">  2 </w:t>
-      </w:r>
-      <w:proofErr w:type="gramStart"/>
-      <w:r>
-        <w:t>Jugadores</w:t>
-      </w:r>
-      <w:proofErr w:type="gramEnd"/>
-      <w:r>
-        <w:t xml:space="preserve"> / vs Máquina</w:t>
+        <w:t xml:space="preserve">  2 Jugadores / vs Máquina</w:t>
       </w:r>
     </w:p>
     <w:p>
@@ -3702,6 +4017,23 @@
 </file>
 
 <file path=customXml/item1.xml><?xml version="1.0" encoding="utf-8"?>
+<p:properties xmlns:p="http://schemas.microsoft.com/office/2006/metadata/properties" xmlns:xsi="http://www.w3.org/2001/XMLSchema-instance" xmlns:pc="http://schemas.microsoft.com/office/infopath/2007/PartnerControls">
+  <documentManagement>
+    <_activity xmlns="c013b157-f355-45ce-93fd-a3645bb08230" xsi:nil="true"/>
+  </documentManagement>
+</p:properties>
+</file>
+
+<file path=customXml/item2.xml><?xml version="1.0" encoding="utf-8"?>
+<?mso-contentType ?>
+<FormTemplates xmlns="http://schemas.microsoft.com/sharepoint/v3/contenttype/forms">
+  <Display>DocumentLibraryForm</Display>
+  <Edit>DocumentLibraryForm</Edit>
+  <New>DocumentLibraryForm</New>
+</FormTemplates>
+</file>
+
+<file path=customXml/item3.xml><?xml version="1.0" encoding="utf-8"?>
 <ct:contentTypeSchema xmlns:ct="http://schemas.microsoft.com/office/2006/metadata/contentType" xmlns:ma="http://schemas.microsoft.com/office/2006/metadata/properties/metaAttributes" ct:_="" ma:_="" ma:contentTypeName="Document" ma:contentTypeID="0x01010008FB866D4CC9514993545F3D7C1DFA59" ma:contentTypeVersion="10" ma:contentTypeDescription="Create a new document." ma:contentTypeScope="" ma:versionID="9629985ee1c24332dccc66f816740f0e">
   <xsd:schema xmlns:xsd="http://www.w3.org/2001/XMLSchema" xmlns:xs="http://www.w3.org/2001/XMLSchema" xmlns:p="http://schemas.microsoft.com/office/2006/metadata/properties" xmlns:ns3="4e571b92-fa24-4f35-a6c1-d4364ed23a3a" xmlns:ns4="c013b157-f355-45ce-93fd-a3645bb08230" targetNamespace="http://schemas.microsoft.com/office/2006/metadata/properties" ma:root="true" ma:fieldsID="e82f8ed9803fbc6a3e9b1e82729a3492" ns3:_="" ns4:_="">
     <xsd:import namespace="4e571b92-fa24-4f35-a6c1-d4364ed23a3a"/>
@@ -3902,24 +4234,25 @@
 </ct:contentTypeSchema>
 </file>
 
-<file path=customXml/item2.xml><?xml version="1.0" encoding="utf-8"?>
-<?mso-contentType ?>
-<FormTemplates xmlns="http://schemas.microsoft.com/sharepoint/v3/contenttype/forms">
-  <Display>DocumentLibraryForm</Display>
-  <Edit>DocumentLibraryForm</Edit>
-  <New>DocumentLibraryForm</New>
-</FormTemplates>
+<file path=customXml/itemProps1.xml><?xml version="1.0" encoding="utf-8"?>
+<ds:datastoreItem xmlns:ds="http://schemas.openxmlformats.org/officeDocument/2006/customXml" ds:itemID="{D101E6A7-8FE8-4D34-B69B-7356F72C7B11}">
+  <ds:schemaRefs>
+    <ds:schemaRef ds:uri="http://schemas.microsoft.com/office/2006/metadata/properties"/>
+    <ds:schemaRef ds:uri="http://schemas.microsoft.com/office/infopath/2007/PartnerControls"/>
+    <ds:schemaRef ds:uri="c013b157-f355-45ce-93fd-a3645bb08230"/>
+  </ds:schemaRefs>
+</ds:datastoreItem>
 </file>
 
-<file path=customXml/item3.xml><?xml version="1.0" encoding="utf-8"?>
-<p:properties xmlns:p="http://schemas.microsoft.com/office/2006/metadata/properties" xmlns:xsi="http://www.w3.org/2001/XMLSchema-instance" xmlns:pc="http://schemas.microsoft.com/office/infopath/2007/PartnerControls">
-  <documentManagement>
-    <_activity xmlns="c013b157-f355-45ce-93fd-a3645bb08230" xsi:nil="true"/>
-  </documentManagement>
-</p:properties>
+<file path=customXml/itemProps2.xml><?xml version="1.0" encoding="utf-8"?>
+<ds:datastoreItem xmlns:ds="http://schemas.openxmlformats.org/officeDocument/2006/customXml" ds:itemID="{96F551C2-6ACC-472C-AAD7-4D1B84402851}">
+  <ds:schemaRefs>
+    <ds:schemaRef ds:uri="http://schemas.microsoft.com/sharepoint/v3/contenttype/forms"/>
+  </ds:schemaRefs>
+</ds:datastoreItem>
 </file>
 
-<file path=customXml/itemProps1.xml><?xml version="1.0" encoding="utf-8"?>
+<file path=customXml/itemProps3.xml><?xml version="1.0" encoding="utf-8"?>
 <ds:datastoreItem xmlns:ds="http://schemas.openxmlformats.org/officeDocument/2006/customXml" ds:itemID="{5EFF820C-909A-457B-9C64-4F78D4430895}">
   <ds:schemaRefs>
     <ds:schemaRef ds:uri="http://schemas.microsoft.com/office/2006/metadata/contentType"/>
@@ -3936,22 +4269,4 @@
     <ds:schemaRef ds:uri="http://schemas.microsoft.com/internal/obd"/>
   </ds:schemaRefs>
 </ds:datastoreItem>
-</file>
-
-<file path=customXml/itemProps2.xml><?xml version="1.0" encoding="utf-8"?>
-<ds:datastoreItem xmlns:ds="http://schemas.openxmlformats.org/officeDocument/2006/customXml" ds:itemID="{96F551C2-6ACC-472C-AAD7-4D1B84402851}">
-  <ds:schemaRefs>
-    <ds:schemaRef ds:uri="http://schemas.microsoft.com/sharepoint/v3/contenttype/forms"/>
-  </ds:schemaRefs>
-</ds:datastoreItem>
-</file>
-
-<file path=customXml/itemProps3.xml><?xml version="1.0" encoding="utf-8"?>
-<ds:datastoreItem xmlns:ds="http://schemas.openxmlformats.org/officeDocument/2006/customXml" ds:itemID="{D101E6A7-8FE8-4D34-B69B-7356F72C7B11}">
-  <ds:schemaRefs>
-    <ds:schemaRef ds:uri="http://schemas.microsoft.com/office/2006/metadata/properties"/>
-    <ds:schemaRef ds:uri="http://schemas.microsoft.com/office/infopath/2007/PartnerControls"/>
-    <ds:schemaRef ds:uri="c013b157-f355-45ce-93fd-a3645bb08230"/>
-  </ds:schemaRefs>
-</ds:datastoreItem>
 </file>
</xml_diff>